<commit_message>
fix bugs in word file
</commit_message>
<xml_diff>
--- a/public/files/تقرير تقييم.docx
+++ b/public/files/تقرير تقييم.docx
@@ -1977,10 +1977,49 @@
             </w:r>
             <w:r>
               <w:rPr>
+                <w:rtl/>
+              </w:rPr>
+              <w:fldChar w:fldCharType="begin"/>
+            </w:r>
+            <w:r>
+              <w:rPr>
+                <w:rtl/>
+              </w:rPr>
+              <w:instrText xml:space="preserve"> </w:instrText>
+            </w:r>
+            <w:r>
+              <w:instrText>MERGEFIELD</w:instrText>
+            </w:r>
+            <w:r>
+              <w:rPr>
+                <w:rtl/>
+              </w:rPr>
+              <w:instrText xml:space="preserve"> أصلأصول </w:instrText>
+            </w:r>
+            <w:r>
+              <w:rPr>
+                <w:rtl/>
+              </w:rPr>
+              <w:fldChar w:fldCharType="separate"/>
+            </w:r>
+            <w:r>
+              <w:rPr>
+                <w:rtl/>
+              </w:rPr>
+              <w:t>«أصلأصول»</w:t>
+            </w:r>
+            <w:r>
+              <w:rPr>
+                <w:rtl/>
+              </w:rPr>
+              <w:fldChar w:fldCharType="end"/>
+            </w:r>
+            <w:r>
+              <w:rPr>
                 <w:rStyle w:val="Hyperlink"/>
                 <w:rtl/>
               </w:rPr>
-              <w:t>الأصل / الأصول محل التقييم</w:t>
+              <w:t xml:space="preserve"> محل التقييم</w:t>
             </w:r>
             <w:r>
               <w:rPr>
@@ -2849,7 +2888,7 @@
                 <w:rStyle w:val="Hyperlink"/>
                 <w:rtl/>
               </w:rPr>
-              <w:t>طبيعة ومصادر المعلومات التي تم الاعتماد عليها (المدخلات الرئيسية المستخدمة)</w:t>
+              <w:t>طبيعة ومصادر المعلومات التي تم الاعتماد عليها (المدخلات الرئيسية المستخدمة</w:t>
             </w:r>
             <w:r>
               <w:rPr>
@@ -2933,10 +2972,49 @@
             </w:r>
             <w:r>
               <w:rPr>
+                <w:rtl/>
+              </w:rPr>
+              <w:fldChar w:fldCharType="begin"/>
+            </w:r>
+            <w:r>
+              <w:rPr>
+                <w:rtl/>
+              </w:rPr>
+              <w:instrText xml:space="preserve"> </w:instrText>
+            </w:r>
+            <w:r>
+              <w:instrText>MERGEFIELD</w:instrText>
+            </w:r>
+            <w:r>
+              <w:rPr>
+                <w:rtl/>
+              </w:rPr>
+              <w:instrText xml:space="preserve"> أصلأصول </w:instrText>
+            </w:r>
+            <w:r>
+              <w:rPr>
+                <w:rtl/>
+              </w:rPr>
+              <w:fldChar w:fldCharType="separate"/>
+            </w:r>
+            <w:r>
+              <w:rPr>
+                <w:rtl/>
+              </w:rPr>
+              <w:t>«أصلأصول»</w:t>
+            </w:r>
+            <w:r>
+              <w:rPr>
+                <w:rtl/>
+              </w:rPr>
+              <w:fldChar w:fldCharType="end"/>
+            </w:r>
+            <w:r>
+              <w:rPr>
                 <w:rStyle w:val="Hyperlink"/>
                 <w:rtl/>
               </w:rPr>
-              <w:t>الأصل / الأصول  محل التقييم</w:t>
+              <w:t xml:space="preserve">  محل التقييم</w:t>
             </w:r>
             <w:r>
               <w:rPr>
@@ -2991,6 +3069,7 @@
             <w:tabs>
               <w:tab w:val="left" w:pos="1929"/>
             </w:tabs>
+            <w:jc w:val="both"/>
             <w:rPr>
               <w:rFonts w:eastAsiaTheme="minorEastAsia" w:cstheme="minorBidi"/>
               <w:b w:val="0"/>
@@ -4133,7 +4212,6 @@
         </w:rPr>
         <w:t xml:space="preserve">تم التقييم وإصدار هذا التقرير وفقا لاتفاقية تنفيذ أعمال التقييم بين شركة </w:t>
       </w:r>
-      <w:proofErr w:type="spellStart"/>
       <w:r>
         <w:rPr>
           <w:rFonts w:cs="CoconNextArabic-Light" w:hint="cs"/>
@@ -4141,17 +4219,7 @@
           <w:szCs w:val="24"/>
           <w:rtl/>
         </w:rPr>
-        <w:t>برو</w:t>
-      </w:r>
-      <w:proofErr w:type="spellEnd"/>
-      <w:r>
-        <w:rPr>
-          <w:rFonts w:cs="CoconNextArabic-Light" w:hint="cs"/>
-          <w:sz w:val="24"/>
-          <w:szCs w:val="24"/>
-          <w:rtl/>
-        </w:rPr>
-        <w:t xml:space="preserve"> اوبشن للاستشارات المهنية</w:t>
+        <w:t>برو اوبشن للاستشارات المهنية</w:t>
       </w:r>
       <w:r>
         <w:rPr>
@@ -5315,21 +5383,12 @@
         </w:rPr>
         <w:t xml:space="preserve">نقر بأننا (شركة </w:t>
       </w:r>
-      <w:proofErr w:type="spellStart"/>
-      <w:r>
-        <w:rPr>
-          <w:rFonts w:cs="CoconNextArabic-Light" w:hint="cs"/>
-          <w:rtl/>
-        </w:rPr>
-        <w:t>برو</w:t>
-      </w:r>
-      <w:proofErr w:type="spellEnd"/>
-      <w:r>
-        <w:rPr>
-          <w:rFonts w:cs="CoconNextArabic-Light" w:hint="cs"/>
-          <w:rtl/>
-        </w:rPr>
-        <w:t xml:space="preserve"> اوبشن للاستشارات المهنية</w:t>
+      <w:r>
+        <w:rPr>
+          <w:rFonts w:cs="CoconNextArabic-Light" w:hint="cs"/>
+          <w:rtl/>
+        </w:rPr>
+        <w:t>برو اوبشن للاستشارات المهنية</w:t>
       </w:r>
       <w:r>
         <w:rPr>
@@ -5494,20 +5553,18 @@
           <w:rtl/>
           <w:lang w:val="en-US"/>
         </w:rPr>
-        <w:t xml:space="preserve">يتولى عمليات التقييم من شركة </w:t>
-      </w:r>
-      <w:proofErr w:type="spellStart"/>
-      <w:r>
-        <w:rPr>
-          <w:rFonts w:cs="CoconNextArabic-Light"/>
+        <w:t xml:space="preserve">يتولى عمليات التقييم من شركة برو اوبشن للاستشارات المهنية ترخيص رقم: </w:t>
+      </w:r>
+      <w:r>
+        <w:rPr>
+          <w:rFonts w:cs="CoconNextArabic-Light" w:hint="cs"/>
           <w:sz w:val="24"/>
           <w:szCs w:val="24"/>
           <w:rtl/>
           <w:lang w:val="en-US"/>
         </w:rPr>
-        <w:t>برو</w:t>
-      </w:r>
-      <w:proofErr w:type="spellEnd"/>
+        <w:t>43034 وعنوانها</w:t>
+      </w:r>
       <w:r>
         <w:rPr>
           <w:rFonts w:cs="CoconNextArabic-Light"/>
@@ -5516,7 +5573,7 @@
           <w:rtl/>
           <w:lang w:val="en-US"/>
         </w:rPr>
-        <w:t xml:space="preserve"> اوبشن للاستشارات المهنية ترخيص رقم: </w:t>
+        <w:t xml:space="preserve"> </w:t>
       </w:r>
       <w:r>
         <w:rPr>
@@ -5526,11 +5583,11 @@
           <w:rtl/>
           <w:lang w:val="en-US"/>
         </w:rPr>
-        <w:t>43034 وعنوانها</w:t>
-      </w:r>
-      <w:r>
-        <w:rPr>
-          <w:rFonts w:cs="CoconNextArabic-Light"/>
+        <w:t>الرئيسي</w:t>
+      </w:r>
+      <w:r>
+        <w:rPr>
+          <w:rFonts w:cs="CoconNextArabic-Light" w:hint="cs"/>
           <w:sz w:val="24"/>
           <w:szCs w:val="24"/>
           <w:rtl/>
@@ -5540,23 +5597,23 @@
       </w:r>
       <w:r>
         <w:rPr>
-          <w:rFonts w:cs="CoconNextArabic-Light" w:hint="cs"/>
+          <w:rFonts w:cs="CoconNextArabic-Light"/>
           <w:sz w:val="24"/>
           <w:szCs w:val="24"/>
           <w:rtl/>
           <w:lang w:val="en-US"/>
         </w:rPr>
-        <w:t>الرئيسي</w:t>
-      </w:r>
-      <w:r>
-        <w:rPr>
-          <w:rFonts w:cs="CoconNextArabic-Light" w:hint="cs"/>
+        <w:t>(</w:t>
+      </w:r>
+      <w:r>
+        <w:rPr>
+          <w:rFonts w:cs="CoconNextArabic-Light"/>
           <w:sz w:val="24"/>
           <w:szCs w:val="24"/>
           <w:rtl/>
           <w:lang w:val="en-US"/>
         </w:rPr>
-        <w:t xml:space="preserve"> </w:t>
+        <w:t>المملكة العربية السعودية، الرياض، حي الدريهمية، شارع صيدا)</w:t>
       </w:r>
       <w:r>
         <w:rPr>
@@ -5566,71 +5623,7 @@
           <w:rtl/>
           <w:lang w:val="en-US"/>
         </w:rPr>
-        <w:t>(</w:t>
-      </w:r>
-      <w:r>
-        <w:rPr>
-          <w:rFonts w:cs="CoconNextArabic-Light"/>
-          <w:sz w:val="24"/>
-          <w:szCs w:val="24"/>
-          <w:rtl/>
-          <w:lang w:val="en-US"/>
-        </w:rPr>
-        <w:t xml:space="preserve">المملكة العربية السعودية، الرياض، حي </w:t>
-      </w:r>
-      <w:proofErr w:type="spellStart"/>
-      <w:r>
-        <w:rPr>
-          <w:rFonts w:cs="CoconNextArabic-Light"/>
-          <w:sz w:val="24"/>
-          <w:szCs w:val="24"/>
-          <w:rtl/>
-          <w:lang w:val="en-US"/>
-        </w:rPr>
-        <w:t>الدريهمية</w:t>
-      </w:r>
-      <w:proofErr w:type="spellEnd"/>
-      <w:r>
-        <w:rPr>
-          <w:rFonts w:cs="CoconNextArabic-Light"/>
-          <w:sz w:val="24"/>
-          <w:szCs w:val="24"/>
-          <w:rtl/>
-          <w:lang w:val="en-US"/>
-        </w:rPr>
-        <w:t>، شارع صيدا)</w:t>
-      </w:r>
-      <w:r>
-        <w:rPr>
-          <w:rFonts w:cs="CoconNextArabic-Light"/>
-          <w:sz w:val="24"/>
-          <w:szCs w:val="24"/>
-          <w:rtl/>
-          <w:lang w:val="en-US"/>
-        </w:rPr>
-        <w:t xml:space="preserve">. يقود تقييم هذا التقرير الأستاذ/ فالح بن مفلح الشهراني الرئيس التنفيذي لشركة </w:t>
-      </w:r>
-      <w:proofErr w:type="spellStart"/>
-      <w:r>
-        <w:rPr>
-          <w:rFonts w:cs="CoconNextArabic-Light"/>
-          <w:sz w:val="24"/>
-          <w:szCs w:val="24"/>
-          <w:rtl/>
-          <w:lang w:val="en-US"/>
-        </w:rPr>
-        <w:t>برو</w:t>
-      </w:r>
-      <w:proofErr w:type="spellEnd"/>
-      <w:r>
-        <w:rPr>
-          <w:rFonts w:cs="CoconNextArabic-Light"/>
-          <w:sz w:val="24"/>
-          <w:szCs w:val="24"/>
-          <w:rtl/>
-          <w:lang w:val="en-US"/>
-        </w:rPr>
-        <w:t xml:space="preserve"> اوبشن للاستشارات المهنية، حاصل على شهادة الماجستير في هندسة البرمجيات من جامعة نيوكاسل بأستراليا، وزميل مرخص معتمد في تقييم الآلات والمعدات والممتلكات المنقولة عضوية رقم: (4210000296)، لديه خبرة في مجال تقييم الآلات والمعدات والممتلكات المنقولة ويناقش الزمالة في مجال تقييم العقارات، جميع الموظفين يمتلكون المؤهلات والقدرة والخبرة اللازمة لتنفيذ التقييم بطريقة تتسم بالموضوعية، والحيادية، والنزاهة، والكفاءة.</w:t>
+        <w:t>. يقود تقييم هذا التقرير الأستاذ/ فالح بن مفلح الشهراني الرئيس التنفيذي لشركة برو اوبشن للاستشارات المهنية، حاصل على شهادة الماجستير في هندسة البرمجيات من جامعة نيوكاسل بأستراليا، وزميل مرخص معتمد في تقييم الآلات والمعدات والممتلكات المنقولة عضوية رقم: (4210000296)، لديه خبرة في مجال تقييم الآلات والمعدات والممتلكات المنقولة ويناقش الزمالة في مجال تقييم العقارات، جميع الموظفين يمتلكون المؤهلات والقدرة والخبرة اللازمة لتنفيذ التقييم بطريقة تتسم بالموضوعية، والحيادية، والنزاهة، والكفاءة.</w:t>
       </w:r>
     </w:p>
     <w:p>
@@ -9130,23 +9123,13 @@
         </w:rPr>
         <w:t xml:space="preserve">لم يتم الاستعانة بأي أخصائي خارجي أثناء تنفيذ هذه المهمة. جميع إجراءات المعاينة، جمع البيانات، التحليل، واستخلاص القيمة تمت حصرا بواسطة فريق التقييم لشركة </w:t>
       </w:r>
-      <w:proofErr w:type="spellStart"/>
-      <w:r>
-        <w:rPr>
-          <w:rFonts w:cs="CoconNextArabic-Light"/>
-          <w:rtl/>
-          <w:lang w:val="en-US"/>
-        </w:rPr>
-        <w:t>برو</w:t>
-      </w:r>
-      <w:proofErr w:type="spellEnd"/>
-      <w:r>
-        <w:rPr>
-          <w:rFonts w:cs="CoconNextArabic-Light"/>
-          <w:rtl/>
-          <w:lang w:val="en-US"/>
-        </w:rPr>
-        <w:t xml:space="preserve"> اوبشن للاستشارات المهنية</w:t>
+      <w:r>
+        <w:rPr>
+          <w:rFonts w:cs="CoconNextArabic-Light"/>
+          <w:rtl/>
+          <w:lang w:val="en-US"/>
+        </w:rPr>
+        <w:t>برو اوبشن للاستشارات المهنية</w:t>
       </w:r>
       <w:r>
         <w:rPr>
@@ -19915,6 +19898,9 @@
   <wne:recipientData>
     <wne:active wne:val="1"/>
     <wne:hash wne:val="1021696160"/>
+  </wne:recipientData>
+  <wne:recipientData>
+    <wne:active wne:val="1"/>
   </wne:recipientData>
   <wne:recipientData>
     <wne:active wne:val="1"/>

</xml_diff>